<commit_message>
Final Assignment Module 6-7
</commit_message>
<xml_diff>
--- a/Module-67/Assignment 6-7.docx
+++ b/Module-67/Assignment 6-7.docx
@@ -75,6 +75,15 @@
         <w:jc w:val="both"/>
       </w:pPr>
       <w:r>
+        <w:t>We did update the test plan template, making it with a .md document, then exporting it to PNGs and compiling them to a PDF.  This prevented weird page breaks in the middle of the tests.  The .md source file is included in the submission.</w:t>
+      </w:r>
+    </w:p>
+    <w:p>
+      <w:pPr>
+        <w:ind w:firstLine="360"/>
+        <w:jc w:val="both"/>
+      </w:pPr>
+      <w:r>
         <w:br/>
       </w:r>
       <w:r>
@@ -228,13 +237,7 @@
         </w:numPr>
       </w:pPr>
       <w:r>
-        <w:t xml:space="preserve">Developer Testing - </w:t>
-      </w:r>
-      <w:r>
-        <w:t>Reservation/Summary Pages</w:t>
-      </w:r>
-      <w:r>
-        <w:t>; Peer Testing – About Us Page</w:t>
+        <w:t>Developer Testing - Reservation/Summary Pages; Peer Testing – About Us Page</w:t>
       </w:r>
     </w:p>
     <w:p>

</xml_diff>